<commit_message>
Refine CoPlaying case and add branded launch actions
</commit_message>
<xml_diff>
--- a/assets/kotlyarenko-pm-coplaying.docx
+++ b/assets/kotlyarenko-pm-coplaying.docx
@@ -789,7 +789,7 @@
                 <w:rFonts w:ascii="Arial" w:hAnsi="Arial"/>
                 <w:sz w:val="18"/>
               </w:rPr>
-              <w:t>Сервис для профессиональных знакомств через совместные игры: сайт и Telegram Mini App.</w:t>
+              <w:t>Telegram Mini App для профессиональных знакомств через совместные игры.</w:t>
             </w:r>
           </w:p>
           <w:p>
@@ -814,7 +814,7 @@
                 <w:rFonts w:ascii="Arial" w:hAnsi="Arial"/>
                 <w:sz w:val="18"/>
               </w:rPr>
-              <w:t>- Сформировал гипотезу на основе собственного поиска профессиональных контактов и разговора с сотрудником банка о сложностях планирования игр с коллегами.</w:t>
+              <w:t>- С Codex и Figma через MCP спроектировал библиотеку компонентов, 111 первичных состояний экранов и кликабельные прототипы пользовательских сценариев.</w:t>
             </w:r>
           </w:p>
           <w:p>
@@ -827,7 +827,7 @@
                 <w:rFonts w:ascii="Arial" w:hAnsi="Arial"/>
                 <w:sz w:val="18"/>
               </w:rPr>
-              <w:t>- Определил объём MVP и путь от выбора игры до комнаты сбора; за 5 дней довёл продукт до текущей стадии MVP и публикации с помощью ИИ-агента, отвечая за требования, приоритеты, приёмку и решения о выпуске.</w:t>
+              <w:t>- Определил MVP и за 5 дней довёл продукт до текущей стадии с ИИ-агентом: отвечал за требования, приоритеты, приёмку и выпуск.</w:t>
             </w:r>
           </w:p>
           <w:p>
@@ -840,7 +840,7 @@
                 <w:rFonts w:ascii="Arial" w:hAnsi="Arial"/>
                 <w:sz w:val="18"/>
               </w:rPr>
-              <w:t>- Спроектировал общие слоты, личные приглашения и встречные предложения; развивал сценарии уведомлений, напоминаний и истории приглашений.</w:t>
+              <w:t>- Развивал сценарии слотов, приглашений и напоминаний по результатам юзабилити-тестирования с целевой аудиторией — сотрудниками корпораций, которые играют в игры.</w:t>
             </w:r>
           </w:p>
           <w:p>
@@ -853,7 +853,7 @@
                 <w:rFonts w:ascii="Arial" w:hAnsi="Arial"/>
                 <w:sz w:val="18"/>
               </w:rPr>
-              <w:t>- Определил активацию, DAU/MAU и возвращаемость; довёл до выпуска закрытую аналитическую сводку без внешних счётчиков.</w:t>
+              <w:t>- Определил набор метрик: регистрации, активация, DAU/MAU, возвращаемость, заполняемость слотов и принятие приглашений; сделал внутренний дашборд для их контроля.</w:t>
             </w:r>
           </w:p>
           <w:p>
@@ -878,7 +878,7 @@
                 <w:rFonts w:ascii="Arial" w:hAnsi="Arial"/>
                 <w:sz w:val="18"/>
               </w:rPr>
-              <w:t>Результат: опубликованный MVP на общей системе аккаунтов и данных. Этап проверки реального использования; выводов о росте и удержании пока нет.</w:t>
+              <w:t>Результат: опубликованный Telegram Mini App со слотами, приглашениями и дашбордом.</w:t>
             </w:r>
           </w:p>
         </w:tc>

</xml_diff>